<commit_message>
style: unify heading color to #4E7EBA across all Word docs (modules 02-05 + appendix)
</commit_message>
<xml_diff>
--- a/02-train-from-scratch/experiments/generation_samples.docx
+++ b/02-train-from-scratch/experiments/generation_samples.docx
@@ -12,7 +12,7 @@
           <w:rFonts w:ascii="Times New Roman" w:hAnsi="Times New Roman" w:eastAsia="微软雅黑"/>
           <w:b/>
           <w:i w:val="0"/>
-          <w:color w:val="1F3964"/>
+          <w:color w:val="4E7EBA"/>
           <w:sz w:val="40"/>
         </w:rPr>
         <w:t>生成样例对比（Generation Samples）</w:t>
@@ -167,7 +167,7 @@
           <w:rFonts w:ascii="Times New Roman" w:hAnsi="Times New Roman" w:eastAsia="微软雅黑"/>
           <w:b/>
           <w:i w:val="0"/>
-          <w:color w:val="1F3964"/>
+          <w:color w:val="4E7EBA"/>
           <w:sz w:val="32"/>
         </w:rPr>
         <w:t>一、消融：Pretrain-only vs SFT（证明指令对齐来自 SFT）</w:t>
@@ -406,7 +406,7 @@
           <w:rFonts w:ascii="Times New Roman" w:hAnsi="Times New Roman" w:eastAsia="微软雅黑"/>
           <w:b/>
           <w:i w:val="0"/>
-          <w:color w:val="1F3964"/>
+          <w:color w:val="4E7EBA"/>
           <w:sz w:val="32"/>
         </w:rPr>
         <w:t>二、Small-SFT vs Medium-SFT（数据规模效应）</w:t>
@@ -690,7 +690,7 @@
           <w:rFonts w:ascii="Times New Roman" w:hAnsi="Times New Roman" w:eastAsia="微软雅黑"/>
           <w:b/>
           <w:i w:val="0"/>
-          <w:color w:val="1F3964"/>
+          <w:color w:val="4E7EBA"/>
           <w:sz w:val="32"/>
         </w:rPr>
         <w:t>三、叠加 LoRA 适配器后（PEFT，只训 0.61% 参数）</w:t>
@@ -910,7 +910,7 @@
           <w:rFonts w:ascii="Times New Roman" w:hAnsi="Times New Roman" w:eastAsia="微软雅黑"/>
           <w:b/>
           <w:i w:val="0"/>
-          <w:color w:val="1F3964"/>
+          <w:color w:val="4E7EBA"/>
           <w:sz w:val="32"/>
         </w:rPr>
         <w:t>四、DPO 偏好对齐后（chosen/rejected，β=0.15）</w:t>
@@ -1061,7 +1061,7 @@
           <w:rFonts w:ascii="Times New Roman" w:hAnsi="Times New Roman" w:eastAsia="微软雅黑"/>
           <w:b/>
           <w:i w:val="0"/>
-          <w:color w:val="1F3964"/>
+          <w:color w:val="4E7EBA"/>
           <w:sz w:val="32"/>
         </w:rPr>
         <w:t>五、客观局限（不回避）</w:t>
@@ -1651,7 +1651,7 @@
       <w:rFonts w:asciiTheme="majorHAnsi" w:eastAsiaTheme="majorEastAsia" w:hAnsiTheme="majorHAnsi" w:cstheme="majorBidi" w:eastAsia="微软雅黑"/>
       <w:b/>
       <w:bCs/>
-      <w:color w:val="365F91" w:themeColor="accent1" w:themeShade="BF"/>
+      <w:color w:val="4E7EBA"/>
       <w:sz w:val="28"/>
       <w:szCs w:val="28"/>
     </w:rPr>
@@ -1675,7 +1675,7 @@
       <w:rFonts w:asciiTheme="majorHAnsi" w:eastAsiaTheme="majorEastAsia" w:hAnsiTheme="majorHAnsi" w:cstheme="majorBidi" w:eastAsia="微软雅黑"/>
       <w:b/>
       <w:bCs/>
-      <w:color w:val="4F81BD" w:themeColor="accent1"/>
+      <w:color w:val="4E7EBA"/>
       <w:sz w:val="26"/>
       <w:szCs w:val="26"/>
     </w:rPr>
@@ -1699,7 +1699,7 @@
       <w:rFonts w:asciiTheme="majorHAnsi" w:eastAsiaTheme="majorEastAsia" w:hAnsiTheme="majorHAnsi" w:cstheme="majorBidi" w:eastAsia="微软雅黑"/>
       <w:b/>
       <w:bCs/>
-      <w:color w:val="4F81BD" w:themeColor="accent1"/>
+      <w:color w:val="4E7EBA"/>
     </w:rPr>
   </w:style>
   <w:style w:type="paragraph" w:styleId="Heading4">
@@ -1724,7 +1724,7 @@
       <w:bCs/>
       <w:i/>
       <w:iCs/>
-      <w:color w:val="4F81BD" w:themeColor="accent1"/>
+      <w:color w:val="4E7EBA"/>
     </w:rPr>
   </w:style>
   <w:style w:type="paragraph" w:styleId="Heading5">

</xml_diff>